<commit_message>
refactor(tahap): enhance table button functionality and layout for improved user interaction and visual consistency
</commit_message>
<xml_diff>
--- a/template/SK-1/BA Penilaian SK I sd SK III.docx
+++ b/template/SK-1/BA Penilaian SK I sd SK III.docx
@@ -168,6 +168,7 @@
         </w:rPr>
         <w:t xml:space="preserve"> </w:t>
       </w:r>
+      <w:proofErr w:type="spellStart"/>
       <w:r>
         <w:rPr>
           <w:rFonts w:ascii="Times New Roman" w:hAnsi="Times New Roman" w:cs="Times New Roman"/>
@@ -176,6 +177,7 @@
         </w:rPr>
         <w:t>Mahasiswa</w:t>
       </w:r>
+      <w:proofErr w:type="spellEnd"/>
       <w:r>
         <w:rPr>
           <w:rFonts w:ascii="Times New Roman" w:hAnsi="Times New Roman" w:cs="Times New Roman"/>
@@ -212,7 +214,23 @@
           <w:rFonts w:ascii="Times New Roman" w:eastAsia="Batang" w:hAnsi="Times New Roman" w:cs="Times New Roman"/>
           <w:color w:val="000000" w:themeColor="text1"/>
         </w:rPr>
-        <w:t>nama mhs)</w:t>
+        <w:t xml:space="preserve">nama </w:t>
+      </w:r>
+      <w:proofErr w:type="spellStart"/>
+      <w:r>
+        <w:rPr>
+          <w:rFonts w:ascii="Times New Roman" w:eastAsia="Batang" w:hAnsi="Times New Roman" w:cs="Times New Roman"/>
+          <w:color w:val="000000" w:themeColor="text1"/>
+        </w:rPr>
+        <w:t>mhs</w:t>
+      </w:r>
+      <w:proofErr w:type="spellEnd"/>
+      <w:r>
+        <w:rPr>
+          <w:rFonts w:ascii="Times New Roman" w:eastAsia="Batang" w:hAnsi="Times New Roman" w:cs="Times New Roman"/>
+          <w:color w:val="000000" w:themeColor="text1"/>
+        </w:rPr>
+        <w:t>)</w:t>
       </w:r>
     </w:p>
     <w:p>
@@ -304,6 +322,7 @@
           <w:color w:val="000000" w:themeColor="text1"/>
         </w:rPr>
       </w:pPr>
+      <w:proofErr w:type="spellStart"/>
       <w:r>
         <w:rPr>
           <w:rFonts w:ascii="Times New Roman" w:hAnsi="Times New Roman" w:cs="Times New Roman"/>
@@ -311,6 +330,7 @@
         </w:rPr>
         <w:t>Judul</w:t>
       </w:r>
+      <w:proofErr w:type="spellEnd"/>
       <w:r>
         <w:rPr>
           <w:rFonts w:ascii="Times New Roman" w:hAnsi="Times New Roman" w:cs="Times New Roman"/>
@@ -319,6 +339,7 @@
         </w:rPr>
         <w:t xml:space="preserve"> </w:t>
       </w:r>
+      <w:proofErr w:type="spellStart"/>
       <w:r>
         <w:rPr>
           <w:rFonts w:ascii="Times New Roman" w:hAnsi="Times New Roman" w:cs="Times New Roman"/>
@@ -327,6 +348,7 @@
         </w:rPr>
         <w:t>Penelitian</w:t>
       </w:r>
+      <w:proofErr w:type="spellEnd"/>
       <w:r>
         <w:rPr>
           <w:rFonts w:ascii="Times New Roman" w:hAnsi="Times New Roman" w:cs="Times New Roman"/>
@@ -364,7 +386,25 @@
           <w:rFonts w:ascii="Times New Roman" w:hAnsi="Times New Roman" w:cs="Times New Roman"/>
           <w:color w:val="000000" w:themeColor="text1"/>
         </w:rPr>
-        <w:t>(judul)</w:t>
+        <w:t>(</w:t>
+      </w:r>
+      <w:proofErr w:type="spellStart"/>
+      <w:r>
+        <w:rPr>
+          <w:rStyle w:val="fontstyle01"/>
+          <w:rFonts w:ascii="Times New Roman" w:hAnsi="Times New Roman" w:cs="Times New Roman"/>
+          <w:color w:val="000000" w:themeColor="text1"/>
+        </w:rPr>
+        <w:t>judul</w:t>
+      </w:r>
+      <w:proofErr w:type="spellEnd"/>
+      <w:r>
+        <w:rPr>
+          <w:rStyle w:val="fontstyle01"/>
+          <w:rFonts w:ascii="Times New Roman" w:hAnsi="Times New Roman" w:cs="Times New Roman"/>
+          <w:color w:val="000000" w:themeColor="text1"/>
+        </w:rPr>
+        <w:t>)</w:t>
       </w:r>
     </w:p>
     <w:p>
@@ -385,7 +425,23 @@
           <w:rFonts w:ascii="Times New Roman" w:hAnsi="Times New Roman" w:cs="Times New Roman"/>
           <w:color w:val="000000" w:themeColor="text1"/>
         </w:rPr>
-        <w:t>Hari/Tanggal Seminar</w:t>
+        <w:t>Hari/</w:t>
+      </w:r>
+      <w:proofErr w:type="spellStart"/>
+      <w:r>
+        <w:rPr>
+          <w:rFonts w:ascii="Times New Roman" w:hAnsi="Times New Roman" w:cs="Times New Roman"/>
+          <w:color w:val="000000" w:themeColor="text1"/>
+        </w:rPr>
+        <w:t>Tanggal</w:t>
+      </w:r>
+      <w:proofErr w:type="spellEnd"/>
+      <w:r>
+        <w:rPr>
+          <w:rFonts w:ascii="Times New Roman" w:hAnsi="Times New Roman" w:cs="Times New Roman"/>
+          <w:color w:val="000000" w:themeColor="text1"/>
+        </w:rPr>
+        <w:t xml:space="preserve"> Seminar</w:t>
       </w:r>
       <w:r>
         <w:rPr>
@@ -409,13 +465,31 @@
         </w:rPr>
         <w:t>$(</w:t>
       </w:r>
-      <w:r>
-        <w:rPr>
-          <w:rFonts w:ascii="Times New Roman" w:hAnsi="Times New Roman" w:cs="Times New Roman"/>
-          <w:color w:val="000000" w:themeColor="text1"/>
-        </w:rPr>
-        <w:t>tgl sidang</w:t>
-      </w:r>
+      <w:proofErr w:type="spellStart"/>
+      <w:r>
+        <w:rPr>
+          <w:rFonts w:ascii="Times New Roman" w:hAnsi="Times New Roman" w:cs="Times New Roman"/>
+          <w:color w:val="000000" w:themeColor="text1"/>
+        </w:rPr>
+        <w:t>tgl</w:t>
+      </w:r>
+      <w:proofErr w:type="spellEnd"/>
+      <w:r>
+        <w:rPr>
+          <w:rFonts w:ascii="Times New Roman" w:hAnsi="Times New Roman" w:cs="Times New Roman"/>
+          <w:color w:val="000000" w:themeColor="text1"/>
+        </w:rPr>
+        <w:t xml:space="preserve"> </w:t>
+      </w:r>
+      <w:proofErr w:type="spellStart"/>
+      <w:r>
+        <w:rPr>
+          <w:rFonts w:ascii="Times New Roman" w:hAnsi="Times New Roman" w:cs="Times New Roman"/>
+          <w:color w:val="000000" w:themeColor="text1"/>
+        </w:rPr>
+        <w:t>sidang</w:t>
+      </w:r>
+      <w:proofErr w:type="spellEnd"/>
       <w:r>
         <w:rPr>
           <w:rFonts w:ascii="Times New Roman" w:hAnsi="Times New Roman" w:cs="Times New Roman"/>
@@ -429,7 +503,23 @@
           <w:color w:val="000000" w:themeColor="text1"/>
         </w:rPr>
         <w:tab/>
-        <w:t xml:space="preserve">Jam:  Pkl </w:t>
+        <w:t xml:space="preserve">Jam:  </w:t>
+      </w:r>
+      <w:proofErr w:type="spellStart"/>
+      <w:r>
+        <w:rPr>
+          <w:rFonts w:ascii="Times New Roman" w:hAnsi="Times New Roman" w:cs="Times New Roman"/>
+          <w:color w:val="000000" w:themeColor="text1"/>
+        </w:rPr>
+        <w:t>Pkl</w:t>
+      </w:r>
+      <w:proofErr w:type="spellEnd"/>
+      <w:r>
+        <w:rPr>
+          <w:rFonts w:ascii="Times New Roman" w:hAnsi="Times New Roman" w:cs="Times New Roman"/>
+          <w:color w:val="000000" w:themeColor="text1"/>
+        </w:rPr>
+        <w:t xml:space="preserve"> </w:t>
       </w:r>
       <w:r>
         <w:rPr>
@@ -439,6 +529,7 @@
         </w:rPr>
         <w:t>$(</w:t>
       </w:r>
+      <w:proofErr w:type="spellStart"/>
       <w:r>
         <w:rPr>
           <w:rFonts w:ascii="Times New Roman" w:hAnsi="Times New Roman" w:cs="Times New Roman"/>
@@ -446,6 +537,7 @@
         </w:rPr>
         <w:t>waktu</w:t>
       </w:r>
+      <w:proofErr w:type="spellEnd"/>
       <w:r>
         <w:rPr>
           <w:rFonts w:ascii="Times New Roman" w:hAnsi="Times New Roman" w:cs="Times New Roman"/>
@@ -488,6 +580,7 @@
           <w:color w:val="000000" w:themeColor="text1"/>
         </w:rPr>
       </w:pPr>
+      <w:proofErr w:type="spellStart"/>
       <w:r>
         <w:rPr>
           <w:rFonts w:ascii="Times New Roman" w:hAnsi="Times New Roman" w:cs="Times New Roman"/>
@@ -495,6 +588,7 @@
         </w:rPr>
         <w:t>Penilaian</w:t>
       </w:r>
+      <w:proofErr w:type="spellEnd"/>
     </w:p>
     <w:tbl>
       <w:tblPr>
@@ -2274,7 +2368,27 @@
                 <w:szCs w:val="24"/>
                 <w:lang w:val="en-US"/>
               </w:rPr>
-              <w:t>Nama Penguji I</w:t>
+              <w:t xml:space="preserve">Nama </w:t>
+            </w:r>
+            <w:proofErr w:type="spellStart"/>
+            <w:r>
+              <w:rPr>
+                <w:color w:val="000000" w:themeColor="text1"/>
+                <w:sz w:val="24"/>
+                <w:szCs w:val="24"/>
+                <w:lang w:val="en-US"/>
+              </w:rPr>
+              <w:t>Penguji</w:t>
+            </w:r>
+            <w:proofErr w:type="spellEnd"/>
+            <w:r>
+              <w:rPr>
+                <w:color w:val="000000" w:themeColor="text1"/>
+                <w:sz w:val="24"/>
+                <w:szCs w:val="24"/>
+                <w:lang w:val="en-US"/>
+              </w:rPr>
+              <w:t xml:space="preserve"> I</w:t>
             </w:r>
             <w:r>
               <w:rPr>
@@ -2420,7 +2534,27 @@
                 <w:szCs w:val="24"/>
                 <w:lang w:val="en-US"/>
               </w:rPr>
-              <w:t>Nama Penguji II</w:t>
+              <w:t xml:space="preserve">Nama </w:t>
+            </w:r>
+            <w:proofErr w:type="spellStart"/>
+            <w:r>
+              <w:rPr>
+                <w:color w:val="000000" w:themeColor="text1"/>
+                <w:sz w:val="24"/>
+                <w:szCs w:val="24"/>
+                <w:lang w:val="en-US"/>
+              </w:rPr>
+              <w:t>Penguji</w:t>
+            </w:r>
+            <w:proofErr w:type="spellEnd"/>
+            <w:r>
+              <w:rPr>
+                <w:color w:val="000000" w:themeColor="text1"/>
+                <w:sz w:val="24"/>
+                <w:szCs w:val="24"/>
+                <w:lang w:val="en-US"/>
+              </w:rPr>
+              <w:t xml:space="preserve"> II</w:t>
             </w:r>
             <w:r>
               <w:rPr>
@@ -2569,7 +2703,27 @@
                 <w:szCs w:val="24"/>
                 <w:lang w:val="en-US"/>
               </w:rPr>
-              <w:t>Nama Penguji III</w:t>
+              <w:t xml:space="preserve">Nama </w:t>
+            </w:r>
+            <w:proofErr w:type="spellStart"/>
+            <w:r>
+              <w:rPr>
+                <w:color w:val="000000" w:themeColor="text1"/>
+                <w:sz w:val="24"/>
+                <w:szCs w:val="24"/>
+                <w:lang w:val="en-US"/>
+              </w:rPr>
+              <w:t>Penguji</w:t>
+            </w:r>
+            <w:proofErr w:type="spellEnd"/>
+            <w:r>
+              <w:rPr>
+                <w:color w:val="000000" w:themeColor="text1"/>
+                <w:sz w:val="24"/>
+                <w:szCs w:val="24"/>
+                <w:lang w:val="en-US"/>
+              </w:rPr>
+              <w:t xml:space="preserve"> III</w:t>
             </w:r>
             <w:r>
               <w:rPr>
@@ -2950,13 +3104,31 @@
         </w:rPr>
         <w:t>$(</w:t>
       </w:r>
+      <w:proofErr w:type="spellStart"/>
       <w:r>
         <w:rPr>
           <w:color w:val="000000" w:themeColor="text1"/>
           <w:sz w:val="22"/>
         </w:rPr>
-        <w:t>tgl sidang</w:t>
-      </w:r>
+        <w:t>tgl</w:t>
+      </w:r>
+      <w:proofErr w:type="spellEnd"/>
+      <w:r>
+        <w:rPr>
+          <w:color w:val="000000" w:themeColor="text1"/>
+          <w:sz w:val="22"/>
+        </w:rPr>
+        <w:t xml:space="preserve"> </w:t>
+      </w:r>
+      <w:proofErr w:type="spellStart"/>
+      <w:r>
+        <w:rPr>
+          <w:color w:val="000000" w:themeColor="text1"/>
+          <w:sz w:val="22"/>
+        </w:rPr>
+        <w:t>sidang</w:t>
+      </w:r>
+      <w:proofErr w:type="spellEnd"/>
       <w:r>
         <w:rPr>
           <w:color w:val="000000" w:themeColor="text1"/>
@@ -2974,6 +3146,7 @@
           <w:sz w:val="22"/>
         </w:rPr>
       </w:pPr>
+      <w:proofErr w:type="spellStart"/>
       <w:r>
         <w:rPr>
           <w:color w:val="000000" w:themeColor="text1"/>
@@ -2981,6 +3154,7 @@
         </w:rPr>
         <w:t>Ketua</w:t>
       </w:r>
+      <w:proofErr w:type="spellEnd"/>
       <w:r>
         <w:rPr>
           <w:color w:val="000000" w:themeColor="text1"/>
@@ -3010,8 +3184,18 @@
           <w:spacing w:val="-2"/>
           <w:sz w:val="22"/>
         </w:rPr>
-        <w:t>Studi Teknik Geofisika</w:t>
-      </w:r>
+        <w:t xml:space="preserve">Studi Teknik </w:t>
+      </w:r>
+      <w:proofErr w:type="spellStart"/>
+      <w:r>
+        <w:rPr>
+          <w:color w:val="000000" w:themeColor="text1"/>
+          <w:spacing w:val="-2"/>
+          <w:sz w:val="22"/>
+        </w:rPr>
+        <w:t>Geofisika</w:t>
+      </w:r>
+      <w:proofErr w:type="spellEnd"/>
     </w:p>
     <w:p>
       <w:pPr>
@@ -3030,7 +3214,6 @@
           <w:b/>
           <w:bCs/>
           <w:color w:val="000000" w:themeColor="text1"/>
-          <w:u w:val="single"/>
         </w:rPr>
       </w:pPr>
       <w:r>
@@ -3038,7 +3221,6 @@
           <w:b/>
           <w:bCs/>
           <w:color w:val="000000" w:themeColor="text1"/>
-          <w:u w:val="single"/>
           <w:lang w:val="id-ID"/>
         </w:rPr>
         <w:t>${signature}</w:t>
@@ -3070,7 +3252,27 @@
           <w:color w:val="000000" w:themeColor="text1"/>
           <w:u w:val="single"/>
         </w:rPr>
-        <w:t>(Nama kaprodi)</w:t>
+        <w:t xml:space="preserve">(Nama </w:t>
+      </w:r>
+      <w:proofErr w:type="spellStart"/>
+      <w:r>
+        <w:rPr>
+          <w:b/>
+          <w:bCs/>
+          <w:color w:val="000000" w:themeColor="text1"/>
+          <w:u w:val="single"/>
+        </w:rPr>
+        <w:t>kaprodi</w:t>
+      </w:r>
+      <w:proofErr w:type="spellEnd"/>
+      <w:r>
+        <w:rPr>
+          <w:b/>
+          <w:bCs/>
+          <w:color w:val="000000" w:themeColor="text1"/>
+          <w:u w:val="single"/>
+        </w:rPr>
+        <w:t>)</w:t>
       </w:r>
     </w:p>
     <w:p>
@@ -3099,7 +3301,21 @@
         <w:rPr>
           <w:color w:val="000000" w:themeColor="text1"/>
         </w:rPr>
-        <w:t>(nip kaprodi)</w:t>
+        <w:t xml:space="preserve">(nip </w:t>
+      </w:r>
+      <w:proofErr w:type="spellStart"/>
+      <w:r>
+        <w:rPr>
+          <w:color w:val="000000" w:themeColor="text1"/>
+        </w:rPr>
+        <w:t>kaprodi</w:t>
+      </w:r>
+      <w:proofErr w:type="spellEnd"/>
+      <w:r>
+        <w:rPr>
+          <w:color w:val="000000" w:themeColor="text1"/>
+        </w:rPr>
+        <w:t>)</w:t>
       </w:r>
     </w:p>
     <w:sectPr>

</xml_diff>